<commit_message>
fix: correct learner login URL and trainer name
- Learner portal now points at tertiarycourses.com.sg/lmslogin (verified 200)
- Trainer is Dr. Alfred Ang throughout the deck, Learner Guide and Lesson Plan
- Lab 07 and Lab 14 decks rebuilt at 16:9 widescreen instead of 4:3

Co-Authored-By: Claude Opus 5 <noreply@anthropic.com>
</commit_message>
<xml_diff>
--- a/courseware/LG-Claude Microsoft 365 Masterclass (C197).docx
+++ b/courseware/LG-Claude Microsoft 365 Masterclass (C197).docx
@@ -336,7 +336,7 @@
               <w:rPr>
                 <w:sz w:val="19"/>
               </w:rPr>
-              <w:t>Jim Gan Chiu Liang (JL)</w:t>
+              <w:t>Dr. Alfred Ang</w:t>
             </w:r>
           </w:p>
         </w:tc>
@@ -394,7 +394,7 @@
               <w:rPr>
                 <w:sz w:val="19"/>
               </w:rPr>
-              <w:t>Jim Gan Chiu Liang (JL)</w:t>
+              <w:t>Dr. Alfred Ang</w:t>
             </w:r>
           </w:p>
         </w:tc>
@@ -452,7 +452,7 @@
               <w:rPr>
                 <w:sz w:val="19"/>
               </w:rPr>
-              <w:t>Jim Gan Chiu Liang (JL)</w:t>
+              <w:t>Dr. Alfred Ang</w:t>
             </w:r>
           </w:p>
         </w:tc>
@@ -510,7 +510,7 @@
               <w:rPr>
                 <w:sz w:val="19"/>
               </w:rPr>
-              <w:t>Jim Gan Chiu Liang (JL)</w:t>
+              <w:t>Dr. Alfred Ang</w:t>
             </w:r>
           </w:p>
         </w:tc>
@@ -568,7 +568,7 @@
               <w:rPr>
                 <w:sz w:val="19"/>
               </w:rPr>
-              <w:t>Jim Gan Chiu Liang (JL)</w:t>
+              <w:t>Dr. Alfred Ang</w:t>
             </w:r>
           </w:p>
         </w:tc>
@@ -626,7 +626,7 @@
               <w:rPr>
                 <w:sz w:val="19"/>
               </w:rPr>
-              <w:t>Jim Gan Chiu Liang (JL)</w:t>
+              <w:t>Dr. Alfred Ang</w:t>
             </w:r>
           </w:p>
         </w:tc>
@@ -684,7 +684,7 @@
               <w:rPr>
                 <w:sz w:val="19"/>
               </w:rPr>
-              <w:t>Jim Gan Chiu Liang (JL)</w:t>
+              <w:t>Dr. Alfred Ang</w:t>
             </w:r>
           </w:p>
         </w:tc>
@@ -742,7 +742,7 @@
               <w:rPr>
                 <w:sz w:val="19"/>
               </w:rPr>
-              <w:t>Jim Gan Chiu Liang (JL)</w:t>
+              <w:t>Dr. Alfred Ang</w:t>
             </w:r>
           </w:p>
         </w:tc>
@@ -800,7 +800,7 @@
               <w:rPr>
                 <w:sz w:val="19"/>
               </w:rPr>
-              <w:t>Jim Gan Chiu Liang (JL)</w:t>
+              <w:t>Dr. Alfred Ang</w:t>
             </w:r>
           </w:p>
         </w:tc>
@@ -858,7 +858,7 @@
               <w:rPr>
                 <w:sz w:val="19"/>
               </w:rPr>
-              <w:t>Jim Gan Chiu Liang (JL)</w:t>
+              <w:t>Dr. Alfred Ang</w:t>
             </w:r>
           </w:p>
         </w:tc>

</xml_diff>